<commit_message>
Propuesta y hoja para fondos: 'una meta propia con fecha' (entrevista, viaje, negocio, siguiente paso) en vez de solo idea de negocio
Co-Authored-By: Claude Fable 5.1 <noreply@anthropic.com>
</commit_message>
<xml_diff>
--- a/recursos/comercial/B2B/PROPUESTA_CONVENIO_FECOLSA.docx
+++ b/recursos/comercial/B2B/PROPUESTA_CONVENIO_FECOLSA.docx
@@ -788,14 +788,14 @@
           <w:b/>
           <w:sz w:val="19"/>
         </w:rPr>
-        <w:t>Idea de negocio propia:</w:t>
+        <w:t>Una meta propia, con fecha:</w:t>
       </w:r>
       <w:r>
         <w:rPr>
           <w:b w:val="0"/>
           <w:sz w:val="19"/>
         </w:rPr>
-        <w:t xml:space="preserve"> a cada estudiante lo empujamos a pensar una y a contarla en inglés.</w:t>
+        <w:t xml:space="preserve"> cada estudiante entra con lo que quiere lograr (una entrevista, un viaje, un negocio propio, el siguiente paso en su trabajo) y lo acompañamos para contarlo y sostenerlo en inglés.</w:t>
       </w:r>
     </w:p>
     <w:p>

</xml_diff>

<commit_message>
Propuesta y hoja para fondos: la meta del estudiante se trabaja como proyecto en ingles, con pasos y fecha
Co-Authored-By: Claude Fable 5.1 <noreply@anthropic.com>
</commit_message>
<xml_diff>
--- a/recursos/comercial/B2B/PROPUESTA_CONVENIO_FECOLSA.docx
+++ b/recursos/comercial/B2B/PROPUESTA_CONVENIO_FECOLSA.docx
@@ -788,14 +788,14 @@
           <w:b/>
           <w:sz w:val="19"/>
         </w:rPr>
-        <w:t>Una meta propia, con fecha:</w:t>
+        <w:t>Su meta, trabajada como proyecto:</w:t>
       </w:r>
       <w:r>
         <w:rPr>
           <w:b w:val="0"/>
           <w:sz w:val="19"/>
         </w:rPr>
-        <w:t xml:space="preserve"> cada estudiante entra con lo que quiere lograr (una entrevista, un viaje, un negocio propio, el siguiente paso en su trabajo) y lo acompañamos para contarlo y sostenerlo en inglés.</w:t>
+        <w:t xml:space="preserve"> cada estudiante entra con lo que quiere lograr (una entrevista, un viaje, un negocio propio, el siguiente paso en su trabajo) y desde el primer día lo trabajamos como un proyecto en inglés, con pasos y fecha.</w:t>
       </w:r>
     </w:p>
     <w:p>

</xml_diff>